<commit_message>
docs: set PA0 team meetings to Tuesday and Saturday 20:00
</commit_message>
<xml_diff>
--- a/pa/PA0/T05-PA0.docx
+++ b/pa/PA0/T05-PA0.docx
@@ -1017,7 +1017,7 @@
     </w:p>
     <w:sdt>
       <w:sdtPr>
-        <w:id w:val="-600682364"/>
+        <w:id w:val="876728923"/>
         <w:docPartObj>
           <w:docPartGallery w:val="Table of Contents"/>
           <w:docPartUnique w:val="1"/>
@@ -7912,7 +7912,12 @@
           <w:szCs w:val="21"/>
           <w:rtl w:val="0"/>
         </w:rPr>
-        <w:t xml:space="preserve">The team plans two internal meetings per week. Tuesday is for discussion and planning: PA requirements, decisions, task assignments, reviewers and deadlines. Saturday is for review and finalization: checking deliverables, resolving feedback and confirming next steps. Exact meeting times are communicated through the group channel.</w:t>
+        <w:t xml:space="preserve">The team holds two internal meetings per week at 20:00 (Vietnam time, UTC+7). Tuesday is for discussion and planning: PA requirements, decisions, task assignments, reviewers and deadlines. Saturday is for review and finalization: checking deliverables, resolving feedback and confirming next steps. Any changes to the meeting schedule are agreed upon and announced through the group channel.</w:t>
+      </w:r>
+      <w:r>
+        <w:rPr>
+          <w:rtl w:val="0"/>
+        </w:rPr>
       </w:r>
     </w:p>
     <w:p>

</xml_diff>